<commit_message>
Knowledge - 8/27/2026 part 3
</commit_message>
<xml_diff>
--- a/Knowledge/1-Academic/1-school/3-First Primary/2-Second Term/Sources - First Primary - Second Term.docx
+++ b/Knowledge/1-Academic/1-school/3-First Primary/2-Second Term/Sources - First Primary - Second Term.docx
@@ -89,6 +89,14 @@
           <w:szCs w:val="18"/>
         </w:rPr>
         <w:t>arabic_1prim_t2</w:t>
+      </w:r>
+      <w:r>
+        <w:rPr>
+          <w:bCs/>
+          <w:sz w:val="18"/>
+          <w:szCs w:val="18"/>
+        </w:rPr>
+        <w:t>.pdf</w:t>
       </w:r>
       <w:r>
         <w:rPr>

</xml_diff>